<commit_message>
Zeitzonen je Mitarbeiter (Profil/Gerät) für Buchungsdatum, Stoppuhr und Zukunftsgrenze; eindeutige Arbeitszeit-IDs + Automigration; Kurzanleitungen neu
</commit_message>
<xml_diff>
--- a/ANLEITUNG.docx
+++ b/ANLEITUNG.docx
@@ -2,7 +2,7 @@
 <file path=word/document.xml><?xml version="1.0" encoding="utf-8"?>
 <w:document xmlns:w="http://schemas.openxmlformats.org/wordprocessingml/2006/main" xmlns:m="http://schemas.openxmlformats.org/officeDocument/2006/math" xmlns:r="http://schemas.openxmlformats.org/officeDocument/2006/relationships" xmlns:o="urn:schemas-microsoft-com:office:office" xmlns:v="urn:schemas-microsoft-com:vml" xmlns:w10="urn:schemas-microsoft-com:office:word" xmlns:a="http://schemas.openxmlformats.org/drawingml/2006/main" xmlns:pic="http://schemas.openxmlformats.org/drawingml/2006/picture" xmlns:wp="http://schemas.openxmlformats.org/drawingml/2006/wordprocessingDrawing">
   <w:body>
-    <w:bookmarkStart w:id="38" w:name="anleitung-zeiterfassung"/>
+    <w:bookmarkStart w:id="39" w:name="anleitung-zeiterfassung"/>
     <w:p>
       <w:pPr>
         <w:pStyle w:val="Heading1"/>
@@ -912,7 +912,7 @@
       </w:r>
     </w:p>
     <w:bookmarkEnd w:id="23"/>
-    <w:bookmarkStart w:id="30" w:name="zeit-erfassen-das-eingabeformular"/>
+    <w:bookmarkStart w:id="31" w:name="zeit-erfassen-das-eingabeformular"/>
     <w:p>
       <w:pPr>
         <w:pStyle w:val="Heading2"/>
@@ -2181,6 +2181,286 @@
         <w:t xml:space="preserve">(GoBD-Monatsabschluss).</w:t>
       </w:r>
     </w:p>
+    <w:bookmarkEnd w:id="29"/>
+    <w:bookmarkStart w:id="30" w:name="X0f5eb3723bd74c266bc10047323af7e3e6f861e"/>
+    <w:p>
+      <w:pPr>
+        <w:pStyle w:val="Heading3"/>
+      </w:pPr>
+      <w:r>
+        <w:t xml:space="preserve">Zeitzone 🌍 (für Kolleginnen und Kollegen im Ausland)</w:t>
+      </w:r>
+    </w:p>
+    <w:p>
+      <w:pPr>
+        <w:pStyle w:val="FirstParagraph"/>
+      </w:pPr>
+      <w:r>
+        <w:t xml:space="preserve">Welcher Tag „heute” ist, bestimmt</w:t>
+      </w:r>
+      <w:r>
+        <w:t xml:space="preserve"> </w:t>
+      </w:r>
+      <w:r>
+        <w:rPr>
+          <w:bCs/>
+          <w:b/>
+        </w:rPr>
+        <w:t xml:space="preserve">deine lokale Zeitzone</w:t>
+      </w:r>
+      <w:r>
+        <w:t xml:space="preserve"> </w:t>
+      </w:r>
+      <w:r>
+        <w:t xml:space="preserve">– nicht die deutsche Uhrzeit.</w:t>
+      </w:r>
+    </w:p>
+    <w:p>
+      <w:pPr>
+        <w:numPr>
+          <w:ilvl w:val="0"/>
+          <w:numId w:val="1010"/>
+        </w:numPr>
+        <w:pStyle w:val="Compact"/>
+      </w:pPr>
+      <w:r>
+        <w:t xml:space="preserve">Oben rechts im Kopfbereich auf deinen</w:t>
+      </w:r>
+      <w:r>
+        <w:t xml:space="preserve"> </w:t>
+      </w:r>
+      <w:r>
+        <w:rPr>
+          <w:bCs/>
+          <w:b/>
+        </w:rPr>
+        <w:t xml:space="preserve">Namen / Avatar</w:t>
+      </w:r>
+      <w:r>
+        <w:t xml:space="preserve"> </w:t>
+      </w:r>
+      <w:r>
+        <w:t xml:space="preserve">klicken.</w:t>
+      </w:r>
+    </w:p>
+    <w:p>
+      <w:pPr>
+        <w:numPr>
+          <w:ilvl w:val="0"/>
+          <w:numId w:val="1010"/>
+        </w:numPr>
+        <w:pStyle w:val="Compact"/>
+      </w:pPr>
+      <w:r>
+        <w:t xml:space="preserve">Unter</w:t>
+      </w:r>
+      <w:r>
+        <w:t xml:space="preserve"> </w:t>
+      </w:r>
+      <w:r>
+        <w:rPr>
+          <w:bCs/>
+          <w:b/>
+        </w:rPr>
+        <w:t xml:space="preserve">„Zeitzone”</w:t>
+      </w:r>
+      <w:r>
+        <w:t xml:space="preserve"> </w:t>
+      </w:r>
+      <w:r>
+        <w:rPr>
+          <w:bCs/>
+          <w:b/>
+        </w:rPr>
+        <w:t xml:space="preserve">„Automatisch (Gerät: …)“</w:t>
+      </w:r>
+      <w:r>
+        <w:t xml:space="preserve"> </w:t>
+      </w:r>
+      <w:r>
+        <w:t xml:space="preserve">belassen (empfohlen) oder eine bestimmte Zone wählen, z. B.</w:t>
+      </w:r>
+      <w:r>
+        <w:t xml:space="preserve"> </w:t>
+      </w:r>
+      <w:r>
+        <w:rPr>
+          <w:iCs/>
+          <w:i/>
+        </w:rPr>
+        <w:t xml:space="preserve">America/Sao_Paulo</w:t>
+      </w:r>
+      <w:r>
+        <w:t xml:space="preserve">. Die Auswahl wird sofort in deinem Profil gespeichert.</w:t>
+      </w:r>
+    </w:p>
+    <w:p>
+      <w:pPr>
+        <w:pStyle w:val="FirstParagraph"/>
+      </w:pPr>
+      <w:r>
+        <w:t xml:space="preserve">Die Zeitzone bestimmt:</w:t>
+      </w:r>
+    </w:p>
+    <w:p>
+      <w:pPr>
+        <w:numPr>
+          <w:ilvl w:val="0"/>
+          <w:numId w:val="1011"/>
+        </w:numPr>
+        <w:pStyle w:val="Compact"/>
+      </w:pPr>
+      <w:r>
+        <w:t xml:space="preserve">das</w:t>
+      </w:r>
+      <w:r>
+        <w:t xml:space="preserve"> </w:t>
+      </w:r>
+      <w:r>
+        <w:rPr>
+          <w:bCs/>
+          <w:b/>
+        </w:rPr>
+        <w:t xml:space="preserve">vorausgewählte Datum</w:t>
+      </w:r>
+      <w:r>
+        <w:t xml:space="preserve"> </w:t>
+      </w:r>
+      <w:r>
+        <w:t xml:space="preserve">(„heute”) im Formular, die Zeitraum-Vorgaben und die Kennzahlen,</w:t>
+      </w:r>
+    </w:p>
+    <w:p>
+      <w:pPr>
+        <w:numPr>
+          <w:ilvl w:val="0"/>
+          <w:numId w:val="1011"/>
+        </w:numPr>
+        <w:pStyle w:val="Compact"/>
+      </w:pPr>
+      <w:r>
+        <w:t xml:space="preserve">die von der Stoppuhr gebuchten</w:t>
+      </w:r>
+      <w:r>
+        <w:t xml:space="preserve"> </w:t>
+      </w:r>
+      <w:r>
+        <w:rPr>
+          <w:bCs/>
+          <w:b/>
+        </w:rPr>
+        <w:t xml:space="preserve">Start- und Endzeiten</w:t>
+      </w:r>
+      <w:r>
+        <w:t xml:space="preserve">,</w:t>
+      </w:r>
+    </w:p>
+    <w:p>
+      <w:pPr>
+        <w:numPr>
+          <w:ilvl w:val="0"/>
+          <w:numId w:val="1011"/>
+        </w:numPr>
+        <w:pStyle w:val="Compact"/>
+      </w:pPr>
+      <w:r>
+        <w:t xml:space="preserve">die</w:t>
+      </w:r>
+      <w:r>
+        <w:t xml:space="preserve"> </w:t>
+      </w:r>
+      <w:r>
+        <w:rPr>
+          <w:bCs/>
+          <w:b/>
+        </w:rPr>
+        <w:t xml:space="preserve">Zukunftsgrenze</w:t>
+      </w:r>
+      <w:r>
+        <w:t xml:space="preserve"> </w:t>
+      </w:r>
+      <w:r>
+        <w:t xml:space="preserve">(„Ende des nächsten Monats” ab deinem lokalen Heute).</w:t>
+      </w:r>
+    </w:p>
+    <w:p>
+      <w:pPr>
+        <w:numPr>
+          <w:ilvl w:val="0"/>
+          <w:numId w:val="1012"/>
+        </w:numPr>
+        <w:pStyle w:val="Compact"/>
+      </w:pPr>
+      <w:r>
+        <w:t xml:space="preserve">Uhrzeiten werden so gespeichert, wie du sie eingibst (lokale Uhrzeit, z. B. 09:00–17:00), und</w:t>
+      </w:r>
+      <w:r>
+        <w:t xml:space="preserve"> </w:t>
+      </w:r>
+      <w:r>
+        <w:rPr>
+          <w:bCs/>
+          <w:b/>
+        </w:rPr>
+        <w:t xml:space="preserve">nicht</w:t>
+      </w:r>
+      <w:r>
+        <w:t xml:space="preserve"> </w:t>
+      </w:r>
+      <w:r>
+        <w:t xml:space="preserve">umgerechnet – Kollegen in Brasilien sehen und behalten ihre eigenen Zeiten.</w:t>
+      </w:r>
+    </w:p>
+    <w:p>
+      <w:pPr>
+        <w:numPr>
+          <w:ilvl w:val="0"/>
+          <w:numId w:val="1012"/>
+        </w:numPr>
+        <w:pStyle w:val="Compact"/>
+      </w:pPr>
+      <w:r>
+        <w:t xml:space="preserve">Bucht ein Projektleiter oder Admin</w:t>
+      </w:r>
+      <w:r>
+        <w:t xml:space="preserve"> </w:t>
+      </w:r>
+      <w:r>
+        <w:rPr>
+          <w:bCs/>
+          <w:b/>
+        </w:rPr>
+        <w:t xml:space="preserve">für einen Mitarbeiter</w:t>
+      </w:r>
+      <w:r>
+        <w:t xml:space="preserve">, gilt die Zeitzone</w:t>
+      </w:r>
+      <w:r>
+        <w:t xml:space="preserve"> </w:t>
+      </w:r>
+      <w:r>
+        <w:rPr>
+          <w:bCs/>
+          <w:b/>
+        </w:rPr>
+        <w:t xml:space="preserve">dieses Mitarbeiters</w:t>
+      </w:r>
+      <w:r>
+        <w:t xml:space="preserve">.</w:t>
+      </w:r>
+    </w:p>
+    <w:p>
+      <w:pPr>
+        <w:numPr>
+          <w:ilvl w:val="0"/>
+          <w:numId w:val="1012"/>
+        </w:numPr>
+        <w:pStyle w:val="Compact"/>
+      </w:pPr>
+      <w:r>
+        <w:t xml:space="preserve">Ohne Profileinstellung wird die Zeitzone des Geräts verwendet, ersatzweise Europe/Berlin.</w:t>
+      </w:r>
+    </w:p>
     <w:p>
       <w:r>
         <w:pict>
@@ -2188,9 +2468,9 @@
         </w:pict>
       </w:r>
     </w:p>
-    <w:bookmarkEnd w:id="29"/>
     <w:bookmarkEnd w:id="30"/>
-    <w:bookmarkStart w:id="34" w:name="die-eintragsliste"/>
+    <w:bookmarkEnd w:id="31"/>
+    <w:bookmarkStart w:id="35" w:name="die-eintragsliste"/>
     <w:p>
       <w:pPr>
         <w:pStyle w:val="Heading2"/>
@@ -2199,7 +2479,7 @@
         <w:t xml:space="preserve">3. Die Eintragsliste</w:t>
       </w:r>
     </w:p>
-    <w:bookmarkStart w:id="31" w:name="filterleiste"/>
+    <w:bookmarkStart w:id="32" w:name="filterleiste"/>
     <w:p>
       <w:pPr>
         <w:pStyle w:val="Heading3"/>
@@ -2505,8 +2785,8 @@
         <w:t xml:space="preserve">Die Kennzahlen oben folgen dem hier gewählten Zeitraum (und bei berechtigten Rollen dem gewählten Mitarbeiter).</w:t>
       </w:r>
     </w:p>
-    <w:bookmarkEnd w:id="31"/>
-    <w:bookmarkStart w:id="32" w:name="liste"/>
+    <w:bookmarkEnd w:id="32"/>
+    <w:bookmarkStart w:id="33" w:name="liste"/>
     <w:p>
       <w:pPr>
         <w:pStyle w:val="Heading3"/>
@@ -2519,7 +2799,7 @@
       <w:pPr>
         <w:numPr>
           <w:ilvl w:val="0"/>
-          <w:numId w:val="1010"/>
+          <w:numId w:val="1013"/>
         </w:numPr>
         <w:pStyle w:val="Compact"/>
       </w:pPr>
@@ -2573,7 +2853,7 @@
       <w:pPr>
         <w:numPr>
           <w:ilvl w:val="0"/>
-          <w:numId w:val="1010"/>
+          <w:numId w:val="1013"/>
         </w:numPr>
         <w:pStyle w:val="Compact"/>
       </w:pPr>
@@ -2627,7 +2907,7 @@
       <w:pPr>
         <w:numPr>
           <w:ilvl w:val="0"/>
-          <w:numId w:val="1010"/>
+          <w:numId w:val="1013"/>
         </w:numPr>
         <w:pStyle w:val="Compact"/>
       </w:pPr>
@@ -2716,7 +2996,7 @@
       <w:pPr>
         <w:numPr>
           <w:ilvl w:val="0"/>
-          <w:numId w:val="1010"/>
+          <w:numId w:val="1013"/>
         </w:numPr>
         <w:pStyle w:val="Compact"/>
       </w:pPr>
@@ -2767,7 +3047,7 @@
       <w:pPr>
         <w:numPr>
           <w:ilvl w:val="0"/>
-          <w:numId w:val="1010"/>
+          <w:numId w:val="1013"/>
         </w:numPr>
         <w:pStyle w:val="Compact"/>
       </w:pPr>
@@ -2789,7 +3069,7 @@
       <w:pPr>
         <w:numPr>
           <w:ilvl w:val="0"/>
-          <w:numId w:val="1010"/>
+          <w:numId w:val="1013"/>
         </w:numPr>
         <w:pStyle w:val="Compact"/>
       </w:pPr>
@@ -2831,8 +3111,8 @@
         <w:t xml:space="preserve">können weder geändert noch gelöscht werden – du erhältst eine Fehlermeldung. Alle Korrekturen werden GoBD-konform im Audit-Log protokolliert.</w:t>
       </w:r>
     </w:p>
-    <w:bookmarkEnd w:id="32"/>
-    <w:bookmarkStart w:id="33" w:name="X8fd63e24872a2f56225dc0713a9ac8b083cbfa0"/>
+    <w:bookmarkEnd w:id="33"/>
+    <w:bookmarkStart w:id="34" w:name="X8fd63e24872a2f56225dc0713a9ac8b083cbfa0"/>
     <w:p>
       <w:pPr>
         <w:pStyle w:val="Heading3"/>
@@ -2901,9 +3181,9 @@
         </w:pict>
       </w:r>
     </w:p>
-    <w:bookmarkEnd w:id="33"/>
     <w:bookmarkEnd w:id="34"/>
-    <w:bookmarkStart w:id="36" w:name="wer-sieht-was"/>
+    <w:bookmarkEnd w:id="35"/>
+    <w:bookmarkStart w:id="37" w:name="wer-sieht-was"/>
     <w:p>
       <w:pPr>
         <w:pStyle w:val="Heading2"/>
@@ -3441,7 +3721,7 @@
         </w:tc>
       </w:tr>
     </w:tbl>
-    <w:bookmarkStart w:id="35" w:name="Xbc7d99f5162ad1a6c87f62045955eab7a03cf58"/>
+    <w:bookmarkStart w:id="36" w:name="Xbc7d99f5162ad1a6c87f62045955eab7a03cf58"/>
     <w:p>
       <w:pPr>
         <w:pStyle w:val="Heading3"/>
@@ -3454,7 +3734,7 @@
       <w:pPr>
         <w:numPr>
           <w:ilvl w:val="0"/>
-          <w:numId w:val="1011"/>
+          <w:numId w:val="1014"/>
         </w:numPr>
         <w:pStyle w:val="Compact"/>
       </w:pPr>
@@ -3498,7 +3778,7 @@
       <w:pPr>
         <w:numPr>
           <w:ilvl w:val="0"/>
-          <w:numId w:val="1011"/>
+          <w:numId w:val="1014"/>
         </w:numPr>
         <w:pStyle w:val="Compact"/>
       </w:pPr>
@@ -3542,7 +3822,7 @@
       <w:pPr>
         <w:numPr>
           <w:ilvl w:val="0"/>
-          <w:numId w:val="1011"/>
+          <w:numId w:val="1014"/>
         </w:numPr>
         <w:pStyle w:val="Compact"/>
       </w:pPr>
@@ -3565,9 +3845,9 @@
         </w:pict>
       </w:r>
     </w:p>
-    <w:bookmarkEnd w:id="35"/>
     <w:bookmarkEnd w:id="36"/>
-    <w:bookmarkStart w:id="37" w:name="häufige-fragen"/>
+    <w:bookmarkEnd w:id="37"/>
+    <w:bookmarkStart w:id="38" w:name="häufige-fragen"/>
     <w:p>
       <w:pPr>
         <w:pStyle w:val="Heading2"/>
@@ -3580,7 +3860,7 @@
       <w:pPr>
         <w:numPr>
           <w:ilvl w:val="0"/>
-          <w:numId w:val="1012"/>
+          <w:numId w:val="1015"/>
         </w:numPr>
         <w:pStyle w:val="Compact"/>
       </w:pPr>
@@ -3602,7 +3882,7 @@
       <w:pPr>
         <w:numPr>
           <w:ilvl w:val="0"/>
-          <w:numId w:val="1012"/>
+          <w:numId w:val="1015"/>
         </w:numPr>
         <w:pStyle w:val="Compact"/>
       </w:pPr>
@@ -3640,7 +3920,7 @@
       <w:pPr>
         <w:numPr>
           <w:ilvl w:val="0"/>
-          <w:numId w:val="1012"/>
+          <w:numId w:val="1015"/>
         </w:numPr>
         <w:pStyle w:val="Compact"/>
       </w:pPr>
@@ -3662,7 +3942,7 @@
       <w:pPr>
         <w:numPr>
           <w:ilvl w:val="0"/>
-          <w:numId w:val="1012"/>
+          <w:numId w:val="1015"/>
         </w:numPr>
         <w:pStyle w:val="Compact"/>
       </w:pPr>
@@ -3700,7 +3980,7 @@
       <w:pPr>
         <w:numPr>
           <w:ilvl w:val="0"/>
-          <w:numId w:val="1012"/>
+          <w:numId w:val="1015"/>
         </w:numPr>
         <w:pStyle w:val="Compact"/>
       </w:pPr>
@@ -3722,7 +4002,7 @@
       <w:pPr>
         <w:numPr>
           <w:ilvl w:val="0"/>
-          <w:numId w:val="1012"/>
+          <w:numId w:val="1015"/>
         </w:numPr>
         <w:pStyle w:val="Compact"/>
       </w:pPr>
@@ -3738,6 +4018,41 @@
       </w:r>
       <w:r>
         <w:t xml:space="preserve">Außer Urlaub und Elternzeit sind Buchungen nur bis zum Ende des nächsten Monats möglich.</w:t>
+      </w:r>
+    </w:p>
+    <w:p>
+      <w:pPr>
+        <w:numPr>
+          <w:ilvl w:val="0"/>
+          <w:numId w:val="1015"/>
+        </w:numPr>
+        <w:pStyle w:val="Compact"/>
+      </w:pPr>
+      <w:r>
+        <w:rPr>
+          <w:bCs/>
+          <w:b/>
+        </w:rPr>
+        <w:t xml:space="preserve">Ich arbeite außerhalb Deutschlands – landen meine Einträge auf dem falschen Tag?</w:t>
+      </w:r>
+      <w:r>
+        <w:t xml:space="preserve"> </w:t>
+      </w:r>
+      <w:r>
+        <w:t xml:space="preserve">Nein. „Heute” wird aus deiner Zeitzone ermittelt (Profileinstellung oder Gerät). Prüfen kannst du das im Profilmenü unter</w:t>
+      </w:r>
+      <w:r>
+        <w:t xml:space="preserve"> </w:t>
+      </w:r>
+      <w:r>
+        <w:rPr>
+          <w:bCs/>
+          <w:b/>
+        </w:rPr>
+        <w:t xml:space="preserve">„Zeitzone”</w:t>
+      </w:r>
+      <w:r>
+        <w:t xml:space="preserve">.</w:t>
       </w:r>
     </w:p>
     <w:p>
@@ -3759,8 +4074,8 @@
         <w:t xml:space="preserve">Insight Arcs – Zeiterfassung &amp; Projekt-Forecast · DSGVO-konform (Hosting in Deutschland) · GoBD- &amp; ArbZG-konform</w:t>
       </w:r>
     </w:p>
-    <w:bookmarkEnd w:id="37"/>
     <w:bookmarkEnd w:id="38"/>
+    <w:bookmarkEnd w:id="39"/>
     <w:sectPr/>
   </w:body>
 </w:document>
@@ -4194,9 +4509,45 @@
     </w:lvlOverride>
   </w:num>
   <w:num w:numId="1010">
+    <w:abstractNumId w:val="99411"/>
+    <w:lvlOverride w:ilvl="0">
+      <w:startOverride w:val="1"/>
+    </w:lvlOverride>
+    <w:lvlOverride w:ilvl="1">
+      <w:startOverride w:val="1"/>
+    </w:lvlOverride>
+    <w:lvlOverride w:ilvl="2">
+      <w:startOverride w:val="1"/>
+    </w:lvlOverride>
+    <w:lvlOverride w:ilvl="3">
+      <w:startOverride w:val="1"/>
+    </w:lvlOverride>
+    <w:lvlOverride w:ilvl="4">
+      <w:startOverride w:val="1"/>
+    </w:lvlOverride>
+    <w:lvlOverride w:ilvl="5">
+      <w:startOverride w:val="1"/>
+    </w:lvlOverride>
+    <w:lvlOverride w:ilvl="6">
+      <w:startOverride w:val="1"/>
+    </w:lvlOverride>
+    <w:lvlOverride w:ilvl="7">
+      <w:startOverride w:val="1"/>
+    </w:lvlOverride>
+    <w:lvlOverride w:ilvl="8">
+      <w:startOverride w:val="1"/>
+    </w:lvlOverride>
+  </w:num>
+  <w:num w:numId="1011">
     <w:abstractNumId w:val="991"/>
   </w:num>
-  <w:num w:numId="1011">
+  <w:num w:numId="1012">
+    <w:abstractNumId w:val="991"/>
+  </w:num>
+  <w:num w:numId="1013">
+    <w:abstractNumId w:val="991"/>
+  </w:num>
+  <w:num w:numId="1014">
     <w:abstractNumId w:val="99411"/>
     <w:lvlOverride w:ilvl="0">
       <w:startOverride w:val="1"/>
@@ -4226,7 +4577,7 @@
       <w:startOverride w:val="1"/>
     </w:lvlOverride>
   </w:num>
-  <w:num w:numId="1012">
+  <w:num w:numId="1015">
     <w:abstractNumId w:val="991"/>
   </w:num>
 </w:numbering>

</xml_diff>